<commit_message>
week 6 & 7 logbook
</commit_message>
<xml_diff>
--- a/LABlogbook.docx
+++ b/LABlogbook.docx
@@ -267,7 +267,7 @@
           <w:u w:val="single"/>
         </w:rPr>
         <w:drawing>
-          <wp:inline distT="0" distB="0" distL="0" distR="0" wp14:anchorId="6F7CBB81" wp14:editId="1E60A9E3">
+          <wp:inline distT="0" distB="0" distL="0" distR="0" wp14:anchorId="6F7CBB81" wp14:editId="60F29833">
             <wp:extent cx="5731510" cy="2618105"/>
             <wp:effectExtent l="0" t="0" r="2540" b="0"/>
             <wp:docPr id="1224433135" name="Picture 7"/>
@@ -326,7 +326,7 @@
           <w:u w:val="single"/>
         </w:rPr>
         <w:drawing>
-          <wp:inline distT="0" distB="0" distL="0" distR="0" wp14:anchorId="5CC91593" wp14:editId="5B13B702">
+          <wp:inline distT="0" distB="0" distL="0" distR="0" wp14:anchorId="5CC91593" wp14:editId="60DB87B8">
             <wp:extent cx="5731510" cy="2522855"/>
             <wp:effectExtent l="0" t="0" r="2540" b="0"/>
             <wp:docPr id="1415559056" name="Picture 1"/>
@@ -385,7 +385,7 @@
           <w:u w:val="single"/>
         </w:rPr>
         <w:drawing>
-          <wp:inline distT="0" distB="0" distL="0" distR="0" wp14:anchorId="3DDDC9B5" wp14:editId="50EACEFE">
+          <wp:inline distT="0" distB="0" distL="0" distR="0" wp14:anchorId="3DDDC9B5" wp14:editId="169EB03B">
             <wp:extent cx="5731510" cy="1337945"/>
             <wp:effectExtent l="0" t="0" r="2540" b="0"/>
             <wp:docPr id="1955722969" name="Picture 2"/>
@@ -560,7 +560,7 @@
           <w:u w:val="single"/>
         </w:rPr>
         <w:drawing>
-          <wp:inline distT="0" distB="0" distL="0" distR="0" wp14:anchorId="2ABC9B79" wp14:editId="0EC905A9">
+          <wp:inline distT="0" distB="0" distL="0" distR="0" wp14:anchorId="2ABC9B79" wp14:editId="24882921">
             <wp:extent cx="5731510" cy="2606675"/>
             <wp:effectExtent l="0" t="0" r="2540" b="3175"/>
             <wp:docPr id="1769641278" name="Picture 6"/>
@@ -620,7 +620,7 @@
         </w:rPr>
         <w:lastRenderedPageBreak/>
         <w:drawing>
-          <wp:inline distT="0" distB="0" distL="0" distR="0" wp14:anchorId="514D75E2" wp14:editId="2C8BEB27">
+          <wp:inline distT="0" distB="0" distL="0" distR="0" wp14:anchorId="514D75E2" wp14:editId="140BD21C">
             <wp:extent cx="5731510" cy="2533650"/>
             <wp:effectExtent l="0" t="0" r="2540" b="0"/>
             <wp:docPr id="1585988100" name="Picture 1"/>
@@ -689,7 +689,7 @@
           <w:u w:val="single"/>
         </w:rPr>
         <w:drawing>
-          <wp:inline distT="0" distB="0" distL="0" distR="0" wp14:anchorId="04BC03FD" wp14:editId="2BC12A99">
+          <wp:inline distT="0" distB="0" distL="0" distR="0" wp14:anchorId="04BC03FD" wp14:editId="2DB5019E">
             <wp:extent cx="5731510" cy="1444625"/>
             <wp:effectExtent l="0" t="0" r="2540" b="3175"/>
             <wp:docPr id="806031253" name="Picture 2"/>
@@ -804,7 +804,7 @@
           <w:u w:val="single"/>
         </w:rPr>
         <w:drawing>
-          <wp:inline distT="0" distB="0" distL="0" distR="0" wp14:anchorId="3E5B01D5" wp14:editId="01762048">
+          <wp:inline distT="0" distB="0" distL="0" distR="0" wp14:anchorId="3E5B01D5" wp14:editId="3B61B04B">
             <wp:extent cx="5731510" cy="2605405"/>
             <wp:effectExtent l="0" t="0" r="2540" b="4445"/>
             <wp:docPr id="656912903" name="Picture 1"/>
@@ -863,7 +863,7 @@
           <w:u w:val="single"/>
         </w:rPr>
         <w:drawing>
-          <wp:inline distT="0" distB="0" distL="0" distR="0" wp14:anchorId="72854500" wp14:editId="59328070">
+          <wp:inline distT="0" distB="0" distL="0" distR="0" wp14:anchorId="72854500" wp14:editId="382D429F">
             <wp:extent cx="5731510" cy="2603500"/>
             <wp:effectExtent l="0" t="0" r="2540" b="6350"/>
             <wp:docPr id="1526142573" name="Picture 2"/>
@@ -1011,7 +1011,7 @@
           <w:u w:val="single"/>
         </w:rPr>
         <w:drawing>
-          <wp:inline distT="0" distB="0" distL="0" distR="0" wp14:anchorId="78441633" wp14:editId="5C44DF2C">
+          <wp:inline distT="0" distB="0" distL="0" distR="0" wp14:anchorId="78441633" wp14:editId="6BC9CF94">
             <wp:extent cx="5731510" cy="2583815"/>
             <wp:effectExtent l="0" t="0" r="2540" b="6985"/>
             <wp:docPr id="20900641" name="Picture 5"/>
@@ -1167,7 +1167,7 @@
           <w:u w:val="single"/>
         </w:rPr>
         <w:drawing>
-          <wp:inline distT="0" distB="0" distL="0" distR="0" wp14:anchorId="2DE5AF4D" wp14:editId="492CF1CB">
+          <wp:inline distT="0" distB="0" distL="0" distR="0" wp14:anchorId="2DE5AF4D" wp14:editId="527BA084">
             <wp:extent cx="5731510" cy="2565400"/>
             <wp:effectExtent l="0" t="0" r="2540" b="6350"/>
             <wp:docPr id="1657721898" name="Picture 1"/>
@@ -1216,7 +1216,7 @@
           <w:u w:val="single"/>
         </w:rPr>
         <w:drawing>
-          <wp:inline distT="0" distB="0" distL="0" distR="0" wp14:anchorId="7C095963" wp14:editId="6C105229">
+          <wp:inline distT="0" distB="0" distL="0" distR="0" wp14:anchorId="7C095963" wp14:editId="7F6B4D26">
             <wp:extent cx="5731510" cy="2595245"/>
             <wp:effectExtent l="0" t="0" r="2540" b="0"/>
             <wp:docPr id="362951545" name="Picture 2"/>
@@ -1473,7 +1473,7 @@
         </w:rPr>
         <w:lastRenderedPageBreak/>
         <w:drawing>
-          <wp:inline distT="0" distB="0" distL="0" distR="0" wp14:anchorId="4A48B705" wp14:editId="0B610CDF">
+          <wp:inline distT="0" distB="0" distL="0" distR="0" wp14:anchorId="4A48B705" wp14:editId="7C024DB0">
             <wp:extent cx="6112793" cy="2757055"/>
             <wp:effectExtent l="0" t="0" r="2540" b="5715"/>
             <wp:docPr id="49937424" name="Picture 7"/>
@@ -1653,6 +1653,651 @@
         <w:lastRenderedPageBreak/>
         <w:t>Lab 6</w:t>
       </w:r>
+    </w:p>
+    <w:p>
+      <w:pPr>
+        <w:jc w:val="both"/>
+        <w:rPr>
+          <w:sz w:val="44"/>
+          <w:szCs w:val="44"/>
+          <w:u w:val="single"/>
+        </w:rPr>
+      </w:pPr>
+      <w:r>
+        <w:rPr>
+          <w:noProof/>
+          <w:sz w:val="44"/>
+          <w:szCs w:val="44"/>
+          <w:u w:val="single"/>
+        </w:rPr>
+        <w:drawing>
+          <wp:inline distT="0" distB="0" distL="0" distR="0" wp14:anchorId="65B5A488" wp14:editId="2F2A1206">
+            <wp:extent cx="5731510" cy="3052445"/>
+            <wp:effectExtent l="0" t="0" r="2540" b="0"/>
+            <wp:docPr id="972595366" name="Picture 1"/>
+            <wp:cNvGraphicFramePr>
+              <a:graphicFrameLocks xmlns:a="http://schemas.openxmlformats.org/drawingml/2006/main" noChangeAspect="1"/>
+            </wp:cNvGraphicFramePr>
+            <a:graphic xmlns:a="http://schemas.openxmlformats.org/drawingml/2006/main">
+              <a:graphicData uri="http://schemas.openxmlformats.org/drawingml/2006/picture">
+                <pic:pic xmlns:pic="http://schemas.openxmlformats.org/drawingml/2006/picture">
+                  <pic:nvPicPr>
+                    <pic:cNvPr id="972595366" name="Picture 972595366"/>
+                    <pic:cNvPicPr/>
+                  </pic:nvPicPr>
+                  <pic:blipFill>
+                    <a:blip r:embed="rId24" cstate="print">
+                      <a:extLst>
+                        <a:ext uri="{28A0092B-C50C-407E-A947-70E740481C1C}">
+                          <a14:useLocalDpi xmlns:a14="http://schemas.microsoft.com/office/drawing/2010/main" val="0"/>
+                        </a:ext>
+                      </a:extLst>
+                    </a:blip>
+                    <a:stretch>
+                      <a:fillRect/>
+                    </a:stretch>
+                  </pic:blipFill>
+                  <pic:spPr>
+                    <a:xfrm>
+                      <a:off x="0" y="0"/>
+                      <a:ext cx="5731510" cy="3052445"/>
+                    </a:xfrm>
+                    <a:prstGeom prst="rect">
+                      <a:avLst/>
+                    </a:prstGeom>
+                  </pic:spPr>
+                </pic:pic>
+              </a:graphicData>
+            </a:graphic>
+          </wp:inline>
+        </w:drawing>
+      </w:r>
+      <w:r>
+        <w:rPr>
+          <w:noProof/>
+          <w:sz w:val="44"/>
+          <w:szCs w:val="44"/>
+          <w:u w:val="single"/>
+        </w:rPr>
+        <w:drawing>
+          <wp:inline distT="0" distB="0" distL="0" distR="0" wp14:anchorId="70371F9A" wp14:editId="4BA90B7A">
+            <wp:extent cx="5731510" cy="3049270"/>
+            <wp:effectExtent l="0" t="0" r="2540" b="0"/>
+            <wp:docPr id="964244491" name="Picture 2"/>
+            <wp:cNvGraphicFramePr>
+              <a:graphicFrameLocks xmlns:a="http://schemas.openxmlformats.org/drawingml/2006/main" noChangeAspect="1"/>
+            </wp:cNvGraphicFramePr>
+            <a:graphic xmlns:a="http://schemas.openxmlformats.org/drawingml/2006/main">
+              <a:graphicData uri="http://schemas.openxmlformats.org/drawingml/2006/picture">
+                <pic:pic xmlns:pic="http://schemas.openxmlformats.org/drawingml/2006/picture">
+                  <pic:nvPicPr>
+                    <pic:cNvPr id="964244491" name="Picture 964244491"/>
+                    <pic:cNvPicPr/>
+                  </pic:nvPicPr>
+                  <pic:blipFill>
+                    <a:blip r:embed="rId25" cstate="print">
+                      <a:extLst>
+                        <a:ext uri="{28A0092B-C50C-407E-A947-70E740481C1C}">
+                          <a14:useLocalDpi xmlns:a14="http://schemas.microsoft.com/office/drawing/2010/main" val="0"/>
+                        </a:ext>
+                      </a:extLst>
+                    </a:blip>
+                    <a:stretch>
+                      <a:fillRect/>
+                    </a:stretch>
+                  </pic:blipFill>
+                  <pic:spPr>
+                    <a:xfrm>
+                      <a:off x="0" y="0"/>
+                      <a:ext cx="5731510" cy="3049270"/>
+                    </a:xfrm>
+                    <a:prstGeom prst="rect">
+                      <a:avLst/>
+                    </a:prstGeom>
+                  </pic:spPr>
+                </pic:pic>
+              </a:graphicData>
+            </a:graphic>
+          </wp:inline>
+        </w:drawing>
+      </w:r>
+      <w:r>
+        <w:rPr>
+          <w:noProof/>
+          <w:sz w:val="44"/>
+          <w:szCs w:val="44"/>
+          <w:u w:val="single"/>
+        </w:rPr>
+        <w:lastRenderedPageBreak/>
+        <w:drawing>
+          <wp:inline distT="0" distB="0" distL="0" distR="0" wp14:anchorId="70707EDC" wp14:editId="0F5BB12F">
+            <wp:extent cx="5731510" cy="3043555"/>
+            <wp:effectExtent l="0" t="0" r="2540" b="4445"/>
+            <wp:docPr id="998012496" name="Picture 3"/>
+            <wp:cNvGraphicFramePr>
+              <a:graphicFrameLocks xmlns:a="http://schemas.openxmlformats.org/drawingml/2006/main" noChangeAspect="1"/>
+            </wp:cNvGraphicFramePr>
+            <a:graphic xmlns:a="http://schemas.openxmlformats.org/drawingml/2006/main">
+              <a:graphicData uri="http://schemas.openxmlformats.org/drawingml/2006/picture">
+                <pic:pic xmlns:pic="http://schemas.openxmlformats.org/drawingml/2006/picture">
+                  <pic:nvPicPr>
+                    <pic:cNvPr id="998012496" name="Picture 998012496"/>
+                    <pic:cNvPicPr/>
+                  </pic:nvPicPr>
+                  <pic:blipFill>
+                    <a:blip r:embed="rId26" cstate="print">
+                      <a:extLst>
+                        <a:ext uri="{28A0092B-C50C-407E-A947-70E740481C1C}">
+                          <a14:useLocalDpi xmlns:a14="http://schemas.microsoft.com/office/drawing/2010/main" val="0"/>
+                        </a:ext>
+                      </a:extLst>
+                    </a:blip>
+                    <a:stretch>
+                      <a:fillRect/>
+                    </a:stretch>
+                  </pic:blipFill>
+                  <pic:spPr>
+                    <a:xfrm>
+                      <a:off x="0" y="0"/>
+                      <a:ext cx="5731510" cy="3043555"/>
+                    </a:xfrm>
+                    <a:prstGeom prst="rect">
+                      <a:avLst/>
+                    </a:prstGeom>
+                  </pic:spPr>
+                </pic:pic>
+              </a:graphicData>
+            </a:graphic>
+          </wp:inline>
+        </w:drawing>
+      </w:r>
+      <w:r>
+        <w:rPr>
+          <w:noProof/>
+          <w:sz w:val="44"/>
+          <w:szCs w:val="44"/>
+          <w:u w:val="single"/>
+        </w:rPr>
+        <w:drawing>
+          <wp:inline distT="0" distB="0" distL="0" distR="0" wp14:anchorId="389C6B3B" wp14:editId="2D82D615">
+            <wp:extent cx="5731510" cy="3046730"/>
+            <wp:effectExtent l="0" t="0" r="2540" b="1270"/>
+            <wp:docPr id="477166778" name="Picture 4"/>
+            <wp:cNvGraphicFramePr>
+              <a:graphicFrameLocks xmlns:a="http://schemas.openxmlformats.org/drawingml/2006/main" noChangeAspect="1"/>
+            </wp:cNvGraphicFramePr>
+            <a:graphic xmlns:a="http://schemas.openxmlformats.org/drawingml/2006/main">
+              <a:graphicData uri="http://schemas.openxmlformats.org/drawingml/2006/picture">
+                <pic:pic xmlns:pic="http://schemas.openxmlformats.org/drawingml/2006/picture">
+                  <pic:nvPicPr>
+                    <pic:cNvPr id="477166778" name="Picture 477166778"/>
+                    <pic:cNvPicPr/>
+                  </pic:nvPicPr>
+                  <pic:blipFill>
+                    <a:blip r:embed="rId27" cstate="print">
+                      <a:extLst>
+                        <a:ext uri="{28A0092B-C50C-407E-A947-70E740481C1C}">
+                          <a14:useLocalDpi xmlns:a14="http://schemas.microsoft.com/office/drawing/2010/main" val="0"/>
+                        </a:ext>
+                      </a:extLst>
+                    </a:blip>
+                    <a:stretch>
+                      <a:fillRect/>
+                    </a:stretch>
+                  </pic:blipFill>
+                  <pic:spPr>
+                    <a:xfrm>
+                      <a:off x="0" y="0"/>
+                      <a:ext cx="5731510" cy="3046730"/>
+                    </a:xfrm>
+                    <a:prstGeom prst="rect">
+                      <a:avLst/>
+                    </a:prstGeom>
+                  </pic:spPr>
+                </pic:pic>
+              </a:graphicData>
+            </a:graphic>
+          </wp:inline>
+        </w:drawing>
+      </w:r>
+      <w:r>
+        <w:rPr>
+          <w:noProof/>
+          <w:sz w:val="44"/>
+          <w:szCs w:val="44"/>
+          <w:u w:val="single"/>
+        </w:rPr>
+        <w:lastRenderedPageBreak/>
+        <w:drawing>
+          <wp:inline distT="0" distB="0" distL="0" distR="0" wp14:anchorId="1D1139AF" wp14:editId="7DD3481F">
+            <wp:extent cx="5731510" cy="3034665"/>
+            <wp:effectExtent l="0" t="0" r="2540" b="0"/>
+            <wp:docPr id="1286115561" name="Picture 5"/>
+            <wp:cNvGraphicFramePr>
+              <a:graphicFrameLocks xmlns:a="http://schemas.openxmlformats.org/drawingml/2006/main" noChangeAspect="1"/>
+            </wp:cNvGraphicFramePr>
+            <a:graphic xmlns:a="http://schemas.openxmlformats.org/drawingml/2006/main">
+              <a:graphicData uri="http://schemas.openxmlformats.org/drawingml/2006/picture">
+                <pic:pic xmlns:pic="http://schemas.openxmlformats.org/drawingml/2006/picture">
+                  <pic:nvPicPr>
+                    <pic:cNvPr id="1286115561" name="Picture 1286115561"/>
+                    <pic:cNvPicPr/>
+                  </pic:nvPicPr>
+                  <pic:blipFill>
+                    <a:blip r:embed="rId28" cstate="print">
+                      <a:extLst>
+                        <a:ext uri="{28A0092B-C50C-407E-A947-70E740481C1C}">
+                          <a14:useLocalDpi xmlns:a14="http://schemas.microsoft.com/office/drawing/2010/main" val="0"/>
+                        </a:ext>
+                      </a:extLst>
+                    </a:blip>
+                    <a:stretch>
+                      <a:fillRect/>
+                    </a:stretch>
+                  </pic:blipFill>
+                  <pic:spPr>
+                    <a:xfrm>
+                      <a:off x="0" y="0"/>
+                      <a:ext cx="5731510" cy="3034665"/>
+                    </a:xfrm>
+                    <a:prstGeom prst="rect">
+                      <a:avLst/>
+                    </a:prstGeom>
+                  </pic:spPr>
+                </pic:pic>
+              </a:graphicData>
+            </a:graphic>
+          </wp:inline>
+        </w:drawing>
+      </w:r>
+      <w:r>
+        <w:rPr>
+          <w:noProof/>
+          <w:sz w:val="44"/>
+          <w:szCs w:val="44"/>
+          <w:u w:val="single"/>
+        </w:rPr>
+        <w:drawing>
+          <wp:inline distT="0" distB="0" distL="0" distR="0" wp14:anchorId="04DF4626" wp14:editId="32F861F8">
+            <wp:extent cx="5731510" cy="3049905"/>
+            <wp:effectExtent l="0" t="0" r="2540" b="0"/>
+            <wp:docPr id="805322984" name="Picture 6"/>
+            <wp:cNvGraphicFramePr>
+              <a:graphicFrameLocks xmlns:a="http://schemas.openxmlformats.org/drawingml/2006/main" noChangeAspect="1"/>
+            </wp:cNvGraphicFramePr>
+            <a:graphic xmlns:a="http://schemas.openxmlformats.org/drawingml/2006/main">
+              <a:graphicData uri="http://schemas.openxmlformats.org/drawingml/2006/picture">
+                <pic:pic xmlns:pic="http://schemas.openxmlformats.org/drawingml/2006/picture">
+                  <pic:nvPicPr>
+                    <pic:cNvPr id="805322984" name="Picture 805322984"/>
+                    <pic:cNvPicPr/>
+                  </pic:nvPicPr>
+                  <pic:blipFill>
+                    <a:blip r:embed="rId29" cstate="print">
+                      <a:extLst>
+                        <a:ext uri="{28A0092B-C50C-407E-A947-70E740481C1C}">
+                          <a14:useLocalDpi xmlns:a14="http://schemas.microsoft.com/office/drawing/2010/main" val="0"/>
+                        </a:ext>
+                      </a:extLst>
+                    </a:blip>
+                    <a:stretch>
+                      <a:fillRect/>
+                    </a:stretch>
+                  </pic:blipFill>
+                  <pic:spPr>
+                    <a:xfrm>
+                      <a:off x="0" y="0"/>
+                      <a:ext cx="5731510" cy="3049905"/>
+                    </a:xfrm>
+                    <a:prstGeom prst="rect">
+                      <a:avLst/>
+                    </a:prstGeom>
+                  </pic:spPr>
+                </pic:pic>
+              </a:graphicData>
+            </a:graphic>
+          </wp:inline>
+        </w:drawing>
+      </w:r>
+      <w:r>
+        <w:rPr>
+          <w:noProof/>
+          <w:sz w:val="44"/>
+          <w:szCs w:val="44"/>
+          <w:u w:val="single"/>
+        </w:rPr>
+        <w:lastRenderedPageBreak/>
+        <w:drawing>
+          <wp:inline distT="0" distB="0" distL="0" distR="0" wp14:anchorId="22B0EFAC" wp14:editId="7330D215">
+            <wp:extent cx="5731510" cy="3043555"/>
+            <wp:effectExtent l="0" t="0" r="2540" b="4445"/>
+            <wp:docPr id="845597648" name="Picture 7"/>
+            <wp:cNvGraphicFramePr>
+              <a:graphicFrameLocks xmlns:a="http://schemas.openxmlformats.org/drawingml/2006/main" noChangeAspect="1"/>
+            </wp:cNvGraphicFramePr>
+            <a:graphic xmlns:a="http://schemas.openxmlformats.org/drawingml/2006/main">
+              <a:graphicData uri="http://schemas.openxmlformats.org/drawingml/2006/picture">
+                <pic:pic xmlns:pic="http://schemas.openxmlformats.org/drawingml/2006/picture">
+                  <pic:nvPicPr>
+                    <pic:cNvPr id="845597648" name="Picture 845597648"/>
+                    <pic:cNvPicPr/>
+                  </pic:nvPicPr>
+                  <pic:blipFill>
+                    <a:blip r:embed="rId30" cstate="print">
+                      <a:extLst>
+                        <a:ext uri="{28A0092B-C50C-407E-A947-70E740481C1C}">
+                          <a14:useLocalDpi xmlns:a14="http://schemas.microsoft.com/office/drawing/2010/main" val="0"/>
+                        </a:ext>
+                      </a:extLst>
+                    </a:blip>
+                    <a:stretch>
+                      <a:fillRect/>
+                    </a:stretch>
+                  </pic:blipFill>
+                  <pic:spPr>
+                    <a:xfrm>
+                      <a:off x="0" y="0"/>
+                      <a:ext cx="5731510" cy="3043555"/>
+                    </a:xfrm>
+                    <a:prstGeom prst="rect">
+                      <a:avLst/>
+                    </a:prstGeom>
+                  </pic:spPr>
+                </pic:pic>
+              </a:graphicData>
+            </a:graphic>
+          </wp:inline>
+        </w:drawing>
+      </w:r>
+      <w:r>
+        <w:rPr>
+          <w:noProof/>
+          <w:sz w:val="44"/>
+          <w:szCs w:val="44"/>
+          <w:u w:val="single"/>
+        </w:rPr>
+        <w:drawing>
+          <wp:inline distT="0" distB="0" distL="0" distR="0" wp14:anchorId="615EF752" wp14:editId="13A67059">
+            <wp:extent cx="5731510" cy="3058160"/>
+            <wp:effectExtent l="0" t="0" r="2540" b="8890"/>
+            <wp:docPr id="1106685893" name="Picture 8"/>
+            <wp:cNvGraphicFramePr>
+              <a:graphicFrameLocks xmlns:a="http://schemas.openxmlformats.org/drawingml/2006/main" noChangeAspect="1"/>
+            </wp:cNvGraphicFramePr>
+            <a:graphic xmlns:a="http://schemas.openxmlformats.org/drawingml/2006/main">
+              <a:graphicData uri="http://schemas.openxmlformats.org/drawingml/2006/picture">
+                <pic:pic xmlns:pic="http://schemas.openxmlformats.org/drawingml/2006/picture">
+                  <pic:nvPicPr>
+                    <pic:cNvPr id="1106685893" name="Picture 1106685893"/>
+                    <pic:cNvPicPr/>
+                  </pic:nvPicPr>
+                  <pic:blipFill>
+                    <a:blip r:embed="rId31" cstate="print">
+                      <a:extLst>
+                        <a:ext uri="{28A0092B-C50C-407E-A947-70E740481C1C}">
+                          <a14:useLocalDpi xmlns:a14="http://schemas.microsoft.com/office/drawing/2010/main" val="0"/>
+                        </a:ext>
+                      </a:extLst>
+                    </a:blip>
+                    <a:stretch>
+                      <a:fillRect/>
+                    </a:stretch>
+                  </pic:blipFill>
+                  <pic:spPr>
+                    <a:xfrm>
+                      <a:off x="0" y="0"/>
+                      <a:ext cx="5731510" cy="3058160"/>
+                    </a:xfrm>
+                    <a:prstGeom prst="rect">
+                      <a:avLst/>
+                    </a:prstGeom>
+                  </pic:spPr>
+                </pic:pic>
+              </a:graphicData>
+            </a:graphic>
+          </wp:inline>
+        </w:drawing>
+      </w:r>
+      <w:r>
+        <w:rPr>
+          <w:noProof/>
+          <w:sz w:val="44"/>
+          <w:szCs w:val="44"/>
+          <w:u w:val="single"/>
+        </w:rPr>
+        <w:lastRenderedPageBreak/>
+        <w:drawing>
+          <wp:inline distT="0" distB="0" distL="0" distR="0" wp14:anchorId="3DC0D5A7" wp14:editId="7311F9BB">
+            <wp:extent cx="5731510" cy="3040380"/>
+            <wp:effectExtent l="0" t="0" r="2540" b="7620"/>
+            <wp:docPr id="1838374419" name="Picture 9"/>
+            <wp:cNvGraphicFramePr>
+              <a:graphicFrameLocks xmlns:a="http://schemas.openxmlformats.org/drawingml/2006/main" noChangeAspect="1"/>
+            </wp:cNvGraphicFramePr>
+            <a:graphic xmlns:a="http://schemas.openxmlformats.org/drawingml/2006/main">
+              <a:graphicData uri="http://schemas.openxmlformats.org/drawingml/2006/picture">
+                <pic:pic xmlns:pic="http://schemas.openxmlformats.org/drawingml/2006/picture">
+                  <pic:nvPicPr>
+                    <pic:cNvPr id="1838374419" name="Picture 1838374419"/>
+                    <pic:cNvPicPr/>
+                  </pic:nvPicPr>
+                  <pic:blipFill>
+                    <a:blip r:embed="rId32" cstate="print">
+                      <a:extLst>
+                        <a:ext uri="{28A0092B-C50C-407E-A947-70E740481C1C}">
+                          <a14:useLocalDpi xmlns:a14="http://schemas.microsoft.com/office/drawing/2010/main" val="0"/>
+                        </a:ext>
+                      </a:extLst>
+                    </a:blip>
+                    <a:stretch>
+                      <a:fillRect/>
+                    </a:stretch>
+                  </pic:blipFill>
+                  <pic:spPr>
+                    <a:xfrm>
+                      <a:off x="0" y="0"/>
+                      <a:ext cx="5731510" cy="3040380"/>
+                    </a:xfrm>
+                    <a:prstGeom prst="rect">
+                      <a:avLst/>
+                    </a:prstGeom>
+                  </pic:spPr>
+                </pic:pic>
+              </a:graphicData>
+            </a:graphic>
+          </wp:inline>
+        </w:drawing>
+      </w:r>
+    </w:p>
+    <w:p>
+      <w:pPr>
+        <w:jc w:val="both"/>
+        <w:rPr>
+          <w:sz w:val="44"/>
+          <w:szCs w:val="44"/>
+          <w:u w:val="single"/>
+        </w:rPr>
+      </w:pPr>
+    </w:p>
+    <w:p>
+      <w:pPr>
+        <w:jc w:val="both"/>
+        <w:rPr>
+          <w:sz w:val="44"/>
+          <w:szCs w:val="44"/>
+          <w:u w:val="single"/>
+        </w:rPr>
+      </w:pPr>
+    </w:p>
+    <w:p>
+      <w:pPr>
+        <w:jc w:val="both"/>
+        <w:rPr>
+          <w:sz w:val="44"/>
+          <w:szCs w:val="44"/>
+          <w:u w:val="single"/>
+        </w:rPr>
+      </w:pPr>
+    </w:p>
+    <w:p>
+      <w:pPr>
+        <w:jc w:val="both"/>
+        <w:rPr>
+          <w:sz w:val="44"/>
+          <w:szCs w:val="44"/>
+          <w:u w:val="single"/>
+        </w:rPr>
+      </w:pPr>
+    </w:p>
+    <w:p>
+      <w:pPr>
+        <w:jc w:val="both"/>
+        <w:rPr>
+          <w:sz w:val="44"/>
+          <w:szCs w:val="44"/>
+          <w:u w:val="single"/>
+        </w:rPr>
+      </w:pPr>
+    </w:p>
+    <w:p>
+      <w:pPr>
+        <w:jc w:val="both"/>
+        <w:rPr>
+          <w:sz w:val="44"/>
+          <w:szCs w:val="44"/>
+          <w:u w:val="single"/>
+        </w:rPr>
+      </w:pPr>
+    </w:p>
+    <w:p>
+      <w:pPr>
+        <w:jc w:val="both"/>
+        <w:rPr>
+          <w:sz w:val="44"/>
+          <w:szCs w:val="44"/>
+          <w:u w:val="single"/>
+        </w:rPr>
+      </w:pPr>
+    </w:p>
+    <w:p>
+      <w:pPr>
+        <w:jc w:val="both"/>
+        <w:rPr>
+          <w:sz w:val="44"/>
+          <w:szCs w:val="44"/>
+          <w:u w:val="single"/>
+        </w:rPr>
+      </w:pPr>
+    </w:p>
+    <w:p>
+      <w:pPr>
+        <w:jc w:val="both"/>
+        <w:rPr>
+          <w:sz w:val="44"/>
+          <w:szCs w:val="44"/>
+          <w:u w:val="single"/>
+        </w:rPr>
+      </w:pPr>
+    </w:p>
+    <w:p>
+      <w:pPr>
+        <w:jc w:val="both"/>
+        <w:rPr>
+          <w:sz w:val="44"/>
+          <w:szCs w:val="44"/>
+          <w:u w:val="single"/>
+        </w:rPr>
+      </w:pPr>
+    </w:p>
+    <w:p>
+      <w:pPr>
+        <w:jc w:val="both"/>
+        <w:rPr>
+          <w:sz w:val="44"/>
+          <w:szCs w:val="44"/>
+          <w:u w:val="single"/>
+        </w:rPr>
+      </w:pPr>
+    </w:p>
+    <w:p>
+      <w:pPr>
+        <w:jc w:val="both"/>
+        <w:rPr>
+          <w:sz w:val="44"/>
+          <w:szCs w:val="44"/>
+          <w:u w:val="single"/>
+        </w:rPr>
+      </w:pPr>
+    </w:p>
+    <w:p>
+      <w:pPr>
+        <w:jc w:val="both"/>
+        <w:rPr>
+          <w:sz w:val="44"/>
+          <w:szCs w:val="44"/>
+          <w:u w:val="single"/>
+        </w:rPr>
+      </w:pPr>
+    </w:p>
+    <w:p>
+      <w:pPr>
+        <w:jc w:val="both"/>
+        <w:rPr>
+          <w:sz w:val="44"/>
+          <w:szCs w:val="44"/>
+          <w:u w:val="single"/>
+        </w:rPr>
+      </w:pPr>
+    </w:p>
+    <w:p>
+      <w:pPr>
+        <w:jc w:val="both"/>
+        <w:rPr>
+          <w:sz w:val="44"/>
+          <w:szCs w:val="44"/>
+          <w:u w:val="single"/>
+        </w:rPr>
+      </w:pPr>
+    </w:p>
+    <w:p>
+      <w:pPr>
+        <w:jc w:val="both"/>
+        <w:rPr>
+          <w:sz w:val="44"/>
+          <w:szCs w:val="44"/>
+          <w:u w:val="single"/>
+        </w:rPr>
+      </w:pPr>
+    </w:p>
+    <w:p>
+      <w:pPr>
+        <w:jc w:val="both"/>
+        <w:rPr>
+          <w:sz w:val="44"/>
+          <w:szCs w:val="44"/>
+          <w:u w:val="single"/>
+        </w:rPr>
+      </w:pPr>
+    </w:p>
+    <w:p>
+      <w:pPr>
+        <w:jc w:val="both"/>
+        <w:rPr>
+          <w:sz w:val="44"/>
+          <w:szCs w:val="44"/>
+          <w:u w:val="single"/>
+        </w:rPr>
+      </w:pPr>
+    </w:p>
+    <w:p>
+      <w:pPr>
+        <w:jc w:val="both"/>
+        <w:rPr>
+          <w:sz w:val="44"/>
+          <w:szCs w:val="44"/>
+          <w:u w:val="single"/>
+        </w:rPr>
+      </w:pPr>
     </w:p>
     <w:p>
       <w:pPr>

</xml_diff>